<commit_message>
Update Word doc to match v6 article
Co-Authored-By: Claude Sonnet 5 <noreply@anthropic.com>
Claude-Session: https://claude.ai/code/session_01RP8rCVarvEGjpHDYnFJ3xW
</commit_message>
<xml_diff>
--- a/linkedin-article.docx
+++ b/linkedin-article.docx
@@ -84,7 +84,7 @@
         </w:rPr>
         <w:t xml:space="preserve"> (</w:t>
       </w:r>
-      <w:hyperlink w:history="1" r:id="rIdnz6agsnox1flw3vzpppp1">
+      <w:hyperlink w:history="1" r:id="rId30hvir1zu-xqppsabwmr2">
         <w:r>
           <w:rPr>
             <w:rFonts w:ascii="Calibri" w:cs="Calibri" w:eastAsia="Calibri" w:hAnsi="Calibri"/>
@@ -163,7 +163,7 @@
           <w:sz w:val="24"/>
           <w:szCs w:val="24"/>
         </w:rPr>
-        <w:t xml:space="preserve">, all outside my day job and much of it at odd hours: nearly a third of all code changes landed between 10pm and 5am, fitted around work and family</w:t>
+        <w:t xml:space="preserve">, entirely outside my day job</w:t>
       </w:r>
     </w:p>
     <w:p>
@@ -184,16 +184,16 @@
           <w:sz w:val="24"/>
           <w:szCs w:val="24"/>
         </w:rPr>
-        <w:t xml:space="preserve">Around 15,000 lines of production code</w:t>
-      </w:r>
-      <w:r>
-        <w:rPr>
-          <w:rFonts w:ascii="Calibri" w:cs="Calibri" w:eastAsia="Calibri" w:hAnsi="Calibri"/>
-          <w:color w:val="201D16"/>
-          <w:sz w:val="24"/>
-          <w:szCs w:val="24"/>
-        </w:rPr>
-        <w:t xml:space="preserve"> (TypeScript, CSS and SQL across 128 files)</w:t>
+        <w:t xml:space="preserve">6 rounds of adversarial testing</w:t>
+      </w:r>
+      <w:r>
+        <w:rPr>
+          <w:rFonts w:ascii="Calibri" w:cs="Calibri" w:eastAsia="Calibri" w:hAnsi="Calibri"/>
+          <w:color w:val="201D16"/>
+          <w:sz w:val="24"/>
+          <w:szCs w:val="24"/>
+        </w:rPr>
+        <w:t xml:space="preserve"> — AI agents role-playing skeptical parents, with no access to the code, deciding honestly whether they'd pay</w:t>
       </w:r>
     </w:p>
     <w:p>
@@ -214,176 +214,30 @@
           <w:sz w:val="24"/>
           <w:szCs w:val="24"/>
         </w:rPr>
-        <w:t xml:space="preserve">185 commits across 20 working branches</w:t>
-      </w:r>
-      <w:r>
-        <w:rPr>
-          <w:rFonts w:ascii="Calibri" w:cs="Calibri" w:eastAsia="Calibri" w:hAnsi="Calibri"/>
-          <w:color w:val="201D16"/>
-          <w:sz w:val="24"/>
-          <w:szCs w:val="24"/>
-        </w:rPr>
-        <w:t xml:space="preserve">, and </w:t>
-      </w:r>
-      <w:r>
-        <w:rPr>
-          <w:rFonts w:ascii="Calibri" w:cs="Calibri" w:eastAsia="Calibri" w:hAnsi="Calibri"/>
-          <w:b/>
-          <w:bCs/>
-          <w:color w:val="201D16"/>
-          <w:sz w:val="24"/>
-          <w:szCs w:val="24"/>
-        </w:rPr>
-        <w:t xml:space="preserve">8+ reviewed production releases</w:t>
-      </w:r>
-      <w:r>
-        <w:rPr>
-          <w:rFonts w:ascii="Calibri" w:cs="Calibri" w:eastAsia="Calibri" w:hAnsi="Calibri"/>
-          <w:color w:val="201D16"/>
-          <w:sz w:val="24"/>
-          <w:szCs w:val="24"/>
-        </w:rPr>
-        <w:t xml:space="preserve">, each one checked with a clean build, lint and type-check before it went live</w:t>
-      </w:r>
-    </w:p>
-    <w:p>
-      <w:pPr>
-        <w:pStyle w:val="ListParagraph"/>
-        <w:numPr>
-          <w:ilvl w:val="0"/>
-          <w:numId w:val="2"/>
-        </w:numPr>
-        <w:spacing w:after="140" w:line="300"/>
-      </w:pPr>
-      <w:r>
-        <w:rPr>
-          <w:rFonts w:ascii="Calibri" w:cs="Calibri" w:eastAsia="Calibri" w:hAnsi="Calibri"/>
-          <w:b/>
-          <w:bCs/>
-          <w:color w:val="201D16"/>
-          <w:sz w:val="24"/>
-          <w:szCs w:val="24"/>
-        </w:rPr>
-        <w:t xml:space="preserve">6 rounds of simulated-customer testing</w:t>
-      </w:r>
-      <w:r>
-        <w:rPr>
-          <w:rFonts w:ascii="Calibri" w:cs="Calibri" w:eastAsia="Calibri" w:hAnsi="Calibri"/>
-          <w:color w:val="201D16"/>
-          <w:sz w:val="24"/>
-          <w:szCs w:val="24"/>
-        </w:rPr>
-        <w:t xml:space="preserve"> (19 in-character parent sessions), plus a </w:t>
-      </w:r>
-      <w:r>
-        <w:rPr>
-          <w:rFonts w:ascii="Calibri" w:cs="Calibri" w:eastAsia="Calibri" w:hAnsi="Calibri"/>
-          <w:b/>
-          <w:bCs/>
-          <w:color w:val="201D16"/>
-          <w:sz w:val="24"/>
-          <w:szCs w:val="24"/>
-        </w:rPr>
-        <w:t xml:space="preserve">6,000-chart simulation</w:t>
-      </w:r>
-      <w:r>
-        <w:rPr>
-          <w:rFonts w:ascii="Calibri" w:cs="Calibri" w:eastAsia="Calibri" w:hAnsi="Calibri"/>
-          <w:color w:val="201D16"/>
-          <w:sz w:val="24"/>
-          <w:szCs w:val="24"/>
-        </w:rPr>
-        <w:t xml:space="preserve"> to prove the scoring was fair</w:t>
-      </w:r>
-    </w:p>
-    <w:p>
-      <w:pPr>
-        <w:pStyle w:val="ListParagraph"/>
-        <w:numPr>
-          <w:ilvl w:val="0"/>
-          <w:numId w:val="2"/>
-        </w:numPr>
-        <w:spacing w:after="140" w:line="300"/>
-      </w:pPr>
-      <w:r>
-        <w:rPr>
-          <w:rFonts w:ascii="Calibri" w:cs="Calibri" w:eastAsia="Calibri" w:hAnsi="Calibri"/>
-          <w:b/>
-          <w:bCs/>
-          <w:color w:val="201D16"/>
-          <w:sz w:val="24"/>
-          <w:szCs w:val="24"/>
-        </w:rPr>
-        <w:t xml:space="preserve">A full UI redesign</w:t>
-      </w:r>
-      <w:r>
-        <w:rPr>
-          <w:rFonts w:ascii="Calibri" w:cs="Calibri" w:eastAsia="Calibri" w:hAnsi="Calibri"/>
-          <w:color w:val="201D16"/>
-          <w:sz w:val="24"/>
-          <w:szCs w:val="24"/>
-        </w:rPr>
-        <w:t xml:space="preserve"> through five rounds of design iteration, a mobile usability audit, and fixes from testing on real phones</w:t>
-      </w:r>
-    </w:p>
-    <w:p>
-      <w:pPr>
-        <w:pStyle w:val="ListParagraph"/>
-        <w:numPr>
-          <w:ilvl w:val="0"/>
-          <w:numId w:val="2"/>
-        </w:numPr>
-        <w:spacing w:after="140" w:line="300"/>
-      </w:pPr>
-      <w:r>
-        <w:rPr>
-          <w:rFonts w:ascii="Calibri" w:cs="Calibri" w:eastAsia="Calibri" w:hAnsi="Calibri"/>
-          <w:b/>
-          <w:bCs/>
-          <w:color w:val="201D16"/>
-          <w:sz w:val="24"/>
-          <w:szCs w:val="24"/>
-        </w:rPr>
-        <w:t xml:space="preserve">SEO from day one:</w:t>
-      </w:r>
-      <w:r>
-        <w:rPr>
-          <w:rFonts w:ascii="Calibri" w:cs="Calibri" w:eastAsia="Calibri" w:hAnsi="Calibri"/>
-          <w:color w:val="201D16"/>
-          <w:sz w:val="24"/>
-          <w:szCs w:val="24"/>
-        </w:rPr>
-        <w:t xml:space="preserve"> 13 blog posts, structured data, a sitemap and Google Search Console</w:t>
-      </w:r>
-    </w:p>
-    <w:p>
-      <w:pPr>
-        <w:pStyle w:val="ListParagraph"/>
-        <w:numPr>
-          <w:ilvl w:val="0"/>
-          <w:numId w:val="2"/>
-        </w:numPr>
-        <w:spacing w:after="140" w:line="300"/>
-      </w:pPr>
-      <w:r>
-        <w:rPr>
-          <w:rFonts w:ascii="Calibri" w:cs="Calibri" w:eastAsia="Calibri" w:hAnsi="Calibri"/>
-          <w:b/>
-          <w:bCs/>
-          <w:color w:val="201D16"/>
-          <w:sz w:val="24"/>
-          <w:szCs w:val="24"/>
-        </w:rPr>
-        <w:t xml:space="preserve">Branding battles:</w:t>
-      </w:r>
-      <w:r>
-        <w:rPr>
-          <w:rFonts w:ascii="Calibri" w:cs="Calibri" w:eastAsia="Calibri" w:hAnsi="Calibri"/>
-          <w:color w:val="201D16"/>
-          <w:sz w:val="24"/>
-          <w:szCs w:val="24"/>
-        </w:rPr>
-        <w:t xml:space="preserve"> littlestargazers.com and .org were both taken, so I settled on littlestargazer.com. When I found a similarly named children's book series, I ran a trademark search (it came back clean), kept the name, and redesigned the logo so the brand stands on its own.</w:t>
+        <w:t xml:space="preserve">A full UI redesign, 13 SEO posts, and a domain and trademark question</w:t>
+      </w:r>
+      <w:r>
+        <w:rPr>
+          <w:rFonts w:ascii="Calibri" w:cs="Calibri" w:eastAsia="Calibri" w:hAnsi="Calibri"/>
+          <w:color w:val="201D16"/>
+          <w:sz w:val="24"/>
+          <w:szCs w:val="24"/>
+        </w:rPr>
+        <w:t xml:space="preserve"> worked through properly rather than skipped</w:t>
+      </w:r>
+    </w:p>
+    <w:p>
+      <w:pPr>
+        <w:spacing w:after="200" w:line="300"/>
+      </w:pPr>
+      <w:r>
+        <w:rPr>
+          <w:rFonts w:ascii="Calibri" w:cs="Calibri" w:eastAsia="Calibri" w:hAnsi="Calibri"/>
+          <w:color w:val="201D16"/>
+          <w:sz w:val="24"/>
+          <w:szCs w:val="24"/>
+        </w:rPr>
+        <w:t xml:space="preserve">None of those numbers are the point on their own. What they add up to is this: every one of them came from a real decision I made, not a default the AI picked for me.</w:t>
       </w:r>
     </w:p>
     <w:p>
@@ -513,27 +367,7 @@
           <w:sz w:val="24"/>
           <w:szCs w:val="24"/>
         </w:rPr>
-        <w:t xml:space="preserve">It's also a deliberate business decision: a low-touch digital product designed as a </w:t>
-      </w:r>
-      <w:r>
-        <w:rPr>
-          <w:rFonts w:ascii="Calibri" w:cs="Calibri" w:eastAsia="Calibri" w:hAnsi="Calibri"/>
-          <w:b/>
-          <w:bCs/>
-          <w:color w:val="201D16"/>
-          <w:sz w:val="24"/>
-          <w:szCs w:val="24"/>
-        </w:rPr>
-        <w:t xml:space="preserve">passive income stream</w:t>
-      </w:r>
-      <w:r>
-        <w:rPr>
-          <w:rFonts w:ascii="Calibri" w:cs="Calibri" w:eastAsia="Calibri" w:hAnsi="Calibri"/>
-          <w:color w:val="201D16"/>
-          <w:sz w:val="24"/>
-          <w:szCs w:val="24"/>
-        </w:rPr>
-        <w:t xml:space="preserve">.</w:t>
+        <w:t xml:space="preserve">It's also a deliberate business decision: a low-overhead, content-driven income stream, not a passive one — it takes ongoing SEO and marketing work to grow, and I keep at that deliberately.</w:t>
       </w:r>
     </w:p>
     <w:p>
@@ -627,6 +461,20 @@
       <w:r>
         <w:rPr>
           <w:rFonts w:ascii="Calibri" w:cs="Calibri" w:eastAsia="Calibri" w:hAnsi="Calibri"/>
+          <w:color w:val="201D16"/>
+          <w:sz w:val="24"/>
+          <w:szCs w:val="24"/>
+        </w:rPr>
+        <w:t xml:space="preserve">None of these are complicated alone. What made them work was doing them in this order, every time, not picking one when it felt convenient:</w:t>
+      </w:r>
+    </w:p>
+    <w:p>
+      <w:pPr>
+        <w:spacing w:after="200" w:line="300"/>
+      </w:pPr>
+      <w:r>
+        <w:rPr>
+          <w:rFonts w:ascii="Calibri" w:cs="Calibri" w:eastAsia="Calibri" w:hAnsi="Calibri"/>
           <w:b/>
           <w:bCs/>
           <w:color w:val="201D16"/>
@@ -692,7 +540,7 @@
           <w:sz w:val="24"/>
           <w:szCs w:val="24"/>
         </w:rPr>
-        <w:t xml:space="preserve"> AI agents role-played skeptical parents of a 4-, 12- and 17-year-old, browsing the live site in character with no access to the code, and decided honestly whether to pay. In one round, all three independently found the same flaw: the age “personalisation” was cosmetic. That's months of customer feedback in an afternoon, and I re-run the test after every major change.</w:t>
+        <w:t xml:space="preserve"> AI agents role-played skeptical parents of a 4-, 12- and 17-year-old, browsing the live site in character with no access to the code, and decided honestly whether to pay. In one round, all three independently found the same flaw: the age “personalisation” was cosmetic. It's not a substitute for real customer feedback — it's a way to catch obvious blind spots before a real parent has to. I still ask real parents directly, and their feedback has caught things the simulated rounds missed. Together, that's a fast first pass and a real check, not one instead of the other.</w:t>
       </w:r>
     </w:p>
     <w:p>
@@ -743,6 +591,20 @@
           <w:szCs w:val="24"/>
         </w:rPr>
         <w:t xml:space="preserve"> A persona walking away, a biased score, a broken edge case: every hard finding made the product better. Build a process that surfaces them early.</w:t>
+      </w:r>
+    </w:p>
+    <w:p>
+      <w:pPr>
+        <w:spacing w:after="200" w:line="300"/>
+      </w:pPr>
+      <w:r>
+        <w:rPr>
+          <w:rFonts w:ascii="Calibri" w:cs="Calibri" w:eastAsia="Calibri" w:hAnsi="Calibri"/>
+          <w:color w:val="201D16"/>
+          <w:sz w:val="24"/>
+          <w:szCs w:val="24"/>
+        </w:rPr>
+        <w:t xml:space="preserve">Run that loop on every feature — constraint first, critic before scale, an uncomfortable finding treated as data rather than a setback — and it doesn't matter whether what you're building is a kids' astrology reading or an internal tool for a 500-person company. The domain changes. The discipline doesn't.</w:t>
       </w:r>
     </w:p>
     <w:p>
@@ -822,7 +684,7 @@
           <w:sz w:val="24"/>
           <w:szCs w:val="24"/>
         </w:rPr>
-        <w:t xml:space="preserve"> a real ephemeris library, with the traditional calculation layers hand-built on top.</w:t>
+        <w:t xml:space="preserve"> a real ephemeris library, with the traditional calculation layers implemented, under my direction, on top.</w:t>
       </w:r>
     </w:p>
     <w:p>
@@ -1197,7 +1059,7 @@
           <w:sz w:val="24"/>
           <w:szCs w:val="24"/>
         </w:rPr>
-        <w:t xml:space="preserve"> of consistent content effort. It's a solid passive income stream rather than a venture-scale bet, and that's exactly what it was designed to be.</w:t>
+        <w:t xml:space="preserve"> of consistent content effort — a research-based estimate, not a result I'm claiming yet. It's built for a modest, sustained income, not a venture-scale outcome, and growing it is a matter of steady SEO and marketing work, not a one-time launch.</w:t>
       </w:r>
     </w:p>
     <w:p>
@@ -1321,7 +1183,7 @@
           <w:sz w:val="24"/>
           <w:szCs w:val="24"/>
         </w:rPr>
-        <w:t xml:space="preserve">That's the work I love, and it's the work I'd bring to any AI product team. If you're building with AI, or deciding how to, I'd love to compare notes.</w:t>
+        <w:t xml:space="preserve">That's the work I love. If you're building with AI, or deciding how to, I'd love to compare notes.</w:t>
       </w:r>
     </w:p>
     <w:p>
@@ -1337,7 +1199,7 @@
         </w:rPr>
         <w:t xml:space="preserve">And if you're a parent who is curious, start with the free sample at </w:t>
       </w:r>
-      <w:hyperlink w:history="1" r:id="rIdx9yhxtgpsi0bomhmcuxua">
+      <w:hyperlink w:history="1" r:id="rIdcbxhkufg-fpjve1uadprd">
         <w:r>
           <w:rPr>
             <w:rFonts w:ascii="Calibri" w:cs="Calibri" w:eastAsia="Calibri" w:hAnsi="Calibri"/>

</xml_diff>